<commit_message>
Update CV Word doc with mentorship of interns and junior developers.
</commit_message>
<xml_diff>
--- a/assets/George_Amany_CV_2025.docx
+++ b/assets/George_Amany_CV_2025.docx
@@ -44,7 +44,7 @@
     </w:p>
     <w:p>
       <w:r>
-        <w:t>Flutter engineer with a Bachelor's degree in Computer Science and production experience building and shipping mobile and desktop applications across education, e-commerce, food services, and influencer marketing. At Neural Design Studios, delivers feature-first Clean Architecture apps using BLoC/Cubit, Dio/Retrofit REST integrations, Firebase, Hive/Floor local storage, and cross-platform desktop tooling (macOS/Windows). Published multiple apps to Google Play and the App Store, authored open-source packages on pub.dev, and set up GitHub Actions CI for automated APK builds.</w:t>
+        <w:t>Flutter engineer with a Bachelor's degree in Computer Science and production experience building and shipping mobile and desktop applications across education, e-commerce, food services, and influencer marketing. At Neural Design Studios, delivers feature-first Clean Architecture apps using BLoC/Cubit, Dio/Retrofit REST integrations, Firebase, Hive/Floor local storage, and cross-platform desktop tooling (macOS/Windows). Published multiple apps to Google Play and the App Store, authored open-source packages on pub.dev, and set up GitHub Actions CI for automated APK builds. Grew quickly under senior mentorship and now mentors interns and junior developers on Flutter, Clean Architecture, and code-quality standards.</w:t>
       </w:r>
     </w:p>
     <w:p>
@@ -57,7 +57,7 @@
     </w:p>
     <w:p>
       <w:r>
-        <w:t>Flutter &amp; Dart, Clean Architecture, BLoC / Cubit State Management, GetIt / Injectable DI, Dio &amp; Retrofit REST APIs, Firebase (Auth, Firestore, Messaging, Crashlytics, Analytics), Hive, Floor &amp; SQLite Local Storage, GoRouter Navigation, Freezed &amp; Dartz, Stripe &amp; Multi-Gateway Payments, Pusher Real-Time, Flutter Desktop (macOS/Windows), Git &amp; GitHub Actions CI/CD, Easy Localization, Postman, Clean Code &amp; Code Review</w:t>
+        <w:t>Flutter &amp; Dart, Clean Architecture, BLoC / Cubit State Management, GetIt / Injectable DI, Dio &amp; Retrofit REST APIs, Firebase (Auth, Firestore, Messaging, Crashlytics, Analytics), Hive, Floor &amp; SQLite Local Storage, GoRouter Navigation, Freezed &amp; Dartz, Stripe &amp; Multi-Gateway Payments, Pusher Real-Time, Flutter Desktop (macOS/Windows), Git &amp; GitHub Actions CI/CD, Easy Localization, Postman, Clean Code &amp; Code Review, Mentoring Interns &amp; Junior Developers</w:t>
       </w:r>
     </w:p>
     <w:p>
@@ -135,6 +135,14 @@
       </w:pPr>
       <w:r>
         <w:t>Published and maintained open-source Flutter packages on pub.dev: animated_contact_us (v0.0.8) and liquid_wave_indicator (v0.2.2).</w:t>
+      </w:r>
+    </w:p>
+    <w:p>
+      <w:pPr>
+        <w:pStyle w:val="ListBullet"/>
+      </w:pPr>
+      <w:r>
+        <w:t>Mentor interns and junior developers — onboarding them onto Flutter, Clean Architecture, and code-review and code-quality practices, and supporting them in shipping their first production features.</w:t>
       </w:r>
     </w:p>
     <w:p>

</xml_diff>